<commit_message>
Uprava dobrodruznych poznamek a rat encounteru
</commit_message>
<xml_diff>
--- a/Essentials/Poznamky_k_dobrodruzstvi.docx
+++ b/Essentials/Poznamky_k_dobrodruzstvi.docx
@@ -6,933 +6,274 @@
       <w:pPr>
         <w:spacing w:after="240"/>
         <w:jc w:val="center"/>
-        <w:pBdr>
-          <w:bottom w:val="single" w:sz="10" w:space="6" w:color="9B6A2D"/>
-        </w:pBdr>
       </w:pPr>
       <w:r>
         <w:rPr>
-          <w:rFonts w:ascii="Garamond" w:hAnsi="Garamond"/>
+          <w:rFonts w:ascii="Georgia" w:hAnsi="Georgia"/>
           <w:b/>
-          <w:i w:val="0"/>
           <w:color w:val="4A260F"/>
           <w:sz w:val="56"/>
         </w:rPr>
-        <w:t>Poklady Trominu - pozn?mky k dobrodru?stv?</w:t>
+        <w:t>Poklady Trominu - poznámky k dobrodružství</w:t>
       </w:r>
     </w:p>
     <w:p>
       <w:pPr>
-        <w:spacing w:before="260" w:after="80"/>
-        <w:pBdr>
-          <w:bottom w:val="single" w:sz="8" w:space="6" w:color="7A4A22"/>
-        </w:pBdr>
+        <w:spacing w:after="60"/>
       </w:pPr>
       <w:r>
         <w:rPr>
-          <w:rFonts w:ascii="Garamond" w:hAnsi="Garamond"/>
-          <w:b/>
-          <w:i w:val="0"/>
-          <w:color w:val="5C3114"/>
-          <w:sz w:val="32"/>
+          <w:rFonts w:ascii="Georgia" w:hAnsi="Georgia"/>
+          <w:color w:val="2D1F15"/>
+          <w:sz w:val="23"/>
         </w:rPr>
-        <w:t>Z?kladn? kostra</w:t>
+        <w:t>Začneme tím že budou zdrhat z nějakýho trezoru, kterej zrovna vyrabovali.</w:t>
       </w:r>
     </w:p>
     <w:p>
       <w:pPr>
-        <w:spacing w:after="100"/>
+        <w:spacing w:after="60"/>
+        <w:ind w:left="259"/>
       </w:pPr>
       <w:r>
         <w:rPr>
-          <w:rFonts w:ascii="Garamond" w:hAnsi="Garamond"/>
-          <w:b w:val="0"/>
-          <w:i w:val="0"/>
+          <w:rFonts w:ascii="Georgia" w:hAnsi="Georgia"/>
           <w:color w:val="2D1F15"/>
           <w:sz w:val="23"/>
         </w:rPr>
-        <w:t>Dobrodru?stv? za?ne uprost?ed akce: dru?ina pr?v? ut?k? z trezoru, kter? vyrabovala. Trezor se nach?z? v Ougrulensk? bance veden? goblin?mi bank??i a skr?valo se v n?m zna?n? mno?stv? zlata. Konkr?tn? detaily loupe?e se dolad? podle postav, jakmile budou hotov?.</w:t>
+        <w:t>V Ougrulenské bance vedené židovskými gobliny se totiž schovávalo spoustu zlata, které družina vakrádá.</w:t>
       </w:r>
     </w:p>
     <w:p>
       <w:pPr>
-        <w:spacing w:before="260" w:after="80"/>
-        <w:pBdr>
-          <w:bottom w:val="single" w:sz="8" w:space="6" w:color="7A4A22"/>
-        </w:pBdr>
+        <w:spacing w:after="60"/>
+        <w:ind w:left="259"/>
       </w:pPr>
       <w:r>
         <w:rPr>
-          <w:rFonts w:ascii="Garamond" w:hAnsi="Garamond"/>
-          <w:b/>
-          <w:i w:val="0"/>
-          <w:color w:val="5C3114"/>
-          <w:sz w:val="32"/>
+          <w:rFonts w:ascii="Georgia" w:hAnsi="Georgia"/>
+          <w:color w:val="2D1F15"/>
+          <w:sz w:val="23"/>
         </w:rPr>
-        <w:t>?vodn? sc?na - ?t?k z banky</w:t>
+        <w:t>Jakmile mi pošlou postavy, vymslím co to bude.</w:t>
       </w:r>
     </w:p>
     <w:p>
       <w:pPr>
-        <w:spacing w:after="100"/>
+        <w:spacing w:after="60" w:before="160"/>
       </w:pPr>
       <w:r>
         <w:rPr>
-          <w:rFonts w:ascii="Garamond" w:hAnsi="Garamond"/>
-          <w:b w:val="0"/>
-          <w:i w:val="0"/>
+          <w:rFonts w:ascii="Georgia" w:hAnsi="Georgia"/>
           <w:color w:val="2D1F15"/>
           <w:sz w:val="23"/>
         </w:rPr>
-        <w:t>Hr??i za??naj? v moment?, kdy je pr?ce v podstat? hotov?, ale bezpe?n? ?t?k je?t? zdaleka ne. C?lem sc?ny je dostat je rychle do tempa, uk?zat jejich schopnosti a d?t jim prostor vy?e?it chaos po loupe?i vlastn?m stylem.</w:t>
+        <w:t>Jakmile se jeden z nich dostane ven, dostanou echo z mrtvé stránky, o tom, že další zakázka od jejich již známého zaměstnavatele na ně čeká v Krčmě Žolas.</w:t>
       </w:r>
     </w:p>
     <w:p>
       <w:pPr>
-        <w:pStyle w:val="ListBullet"/>
-        <w:spacing w:after="40"/>
-        <w:ind w:left="360"/>
+        <w:spacing w:after="60"/>
       </w:pPr>
       <w:r>
         <w:rPr>
-          <w:rFonts w:ascii="Garamond" w:hAnsi="Garamond"/>
-          <w:b w:val="0"/>
-          <w:i w:val="0"/>
+          <w:rFonts w:ascii="Georgia" w:hAnsi="Georgia"/>
           <w:color w:val="2D1F15"/>
           <w:sz w:val="23"/>
         </w:rPr>
-        <w:t>M?sto: Ougrulensk? banka.</w:t>
+        <w:t>Tam se setkají s jedním gnomeme, který jim předá informace o artefaktu, který je pro tuto skupinu důležitý na získání.</w:t>
       </w:r>
     </w:p>
     <w:p>
       <w:pPr>
-        <w:pStyle w:val="ListBullet"/>
-        <w:spacing w:after="40"/>
-        <w:ind w:left="360"/>
+        <w:spacing w:after="60"/>
+        <w:ind w:left="259"/>
       </w:pPr>
       <w:r>
         <w:rPr>
-          <w:rFonts w:ascii="Garamond" w:hAnsi="Garamond"/>
-          <w:b w:val="0"/>
-          <w:i w:val="0"/>
+          <w:rFonts w:ascii="Georgia" w:hAnsi="Georgia"/>
           <w:color w:val="2D1F15"/>
           <w:sz w:val="23"/>
         </w:rPr>
-        <w:t>Situace: dru?ina prch? z trezoru se zlatem nebo jinou ko?ist?.</w:t>
+        <w:t>Popíše jim že se jedná o artefakt vyrobený za dob války, který v sobě nese spousty magického vědění.</w:t>
       </w:r>
     </w:p>
     <w:p>
       <w:pPr>
-        <w:pStyle w:val="ListBullet"/>
-        <w:spacing w:after="40"/>
-        <w:ind w:left="360"/>
+        <w:spacing w:after="60" w:before="160"/>
       </w:pPr>
       <w:r>
         <w:rPr>
-          <w:rFonts w:ascii="Garamond" w:hAnsi="Garamond"/>
-          <w:b w:val="0"/>
-          <w:i w:val="0"/>
+          <w:rFonts w:ascii="Georgia" w:hAnsi="Georgia"/>
           <w:color w:val="2D1F15"/>
           <w:sz w:val="23"/>
         </w:rPr>
-        <w:t>T?n: rychl?, hlu?n?, nebezpe?n? a trochu ?pinav?.</w:t>
+        <w:t>Odkáže je na starou propadlou pevnost, která byla za války zavalena. Vede do ní naštěstí jedna zadní cestička.</w:t>
       </w:r>
     </w:p>
     <w:p>
       <w:pPr>
-        <w:pStyle w:val="ListBullet"/>
-        <w:spacing w:after="40"/>
-        <w:ind w:left="360"/>
+        <w:spacing w:after="60"/>
+        <w:ind w:left="259"/>
       </w:pPr>
       <w:r>
         <w:rPr>
-          <w:rFonts w:ascii="Garamond" w:hAnsi="Garamond"/>
-          <w:b w:val="0"/>
-          <w:i w:val="0"/>
+          <w:rFonts w:ascii="Georgia" w:hAnsi="Georgia"/>
           <w:color w:val="2D1F15"/>
           <w:sz w:val="23"/>
         </w:rPr>
-        <w:t>Detaily p?ek??ek se uprav? podle fin?ln?ch postav.</w:t>
+        <w:t>Poté co se s Družinou dohodnou tak je vyšle na cestu.</w:t>
       </w:r>
     </w:p>
     <w:p>
       <w:pPr>
-        <w:spacing w:before="260" w:after="80"/>
-        <w:pBdr>
-          <w:bottom w:val="single" w:sz="8" w:space="6" w:color="7A4A22"/>
-        </w:pBdr>
+        <w:spacing w:after="60" w:before="160"/>
       </w:pPr>
       <w:r>
         <w:rPr>
-          <w:rFonts w:ascii="Garamond" w:hAnsi="Garamond"/>
-          <w:b/>
-          <w:i w:val="0"/>
-          <w:color w:val="5C3114"/>
-          <w:sz w:val="32"/>
+          <w:rFonts w:ascii="Georgia" w:hAnsi="Georgia"/>
+          <w:color w:val="2D1F15"/>
+          <w:sz w:val="23"/>
         </w:rPr>
-        <w:t>Echo z mrtv? schr?nky</w:t>
+        <w:t>Cestování skipneme možná dáme jen malou montáž.</w:t>
       </w:r>
     </w:p>
     <w:p>
       <w:pPr>
-        <w:spacing w:after="100"/>
+        <w:spacing w:after="60" w:before="160"/>
+        <w:ind w:left="259"/>
       </w:pPr>
       <w:r>
         <w:rPr>
-          <w:rFonts w:ascii="Garamond" w:hAnsi="Garamond"/>
-          <w:b w:val="0"/>
-          <w:i w:val="0"/>
+          <w:rFonts w:ascii="Georgia" w:hAnsi="Georgia"/>
           <w:color w:val="2D1F15"/>
           <w:sz w:val="23"/>
         </w:rPr>
-        <w:t>Jakmile se alespo? jeden ?len dru?iny dostane ven, p?ijde zpr?va z mrtv? schr?nky. Zpr?va oznamuje, ?e na n? ?ek? dal?? zak?zka od jejich ji? zn?m?ho zam?stnavatele.</w:t>
+        <w:t>Uvnitř najdou starou zapadlou pevnost po myšších lidech. Jen teda nebejvá úplně prázdná.</w:t>
       </w:r>
     </w:p>
     <w:p>
       <w:pPr>
-        <w:spacing w:after="40"/>
+        <w:spacing w:after="60"/>
+        <w:ind w:left="259"/>
       </w:pPr>
       <w:r>
         <w:rPr>
-          <w:rFonts w:ascii="Garamond" w:hAnsi="Garamond"/>
-          <w:b/>
-          <w:i w:val="0"/>
-          <w:color w:val="5C3114"/>
-          <w:sz w:val="23"/>
-        </w:rPr>
-        <w:t xml:space="preserve">M?sto setk?n?: </w:t>
-      </w:r>
-      <w:r>
-        <w:rPr>
-          <w:rFonts w:ascii="Garamond" w:hAnsi="Garamond"/>
-          <w:b w:val="0"/>
-          <w:i w:val="0"/>
+          <w:rFonts w:ascii="Georgia" w:hAnsi="Georgia"/>
           <w:color w:val="2D1F15"/>
           <w:sz w:val="23"/>
         </w:rPr>
-        <w:t>Kr?ma ?olas</w:t>
+        <w:t>Myší lidé zde po zavalení pevnosti žili v izolaci a tak se budou hodě hádat o tom co udělají s družinou</w:t>
       </w:r>
     </w:p>
     <w:p>
       <w:pPr>
-        <w:spacing w:after="40"/>
+        <w:spacing w:after="60"/>
+        <w:ind w:left="518"/>
       </w:pPr>
       <w:r>
         <w:rPr>
-          <w:rFonts w:ascii="Garamond" w:hAnsi="Garamond"/>
-          <w:b/>
-          <w:i w:val="0"/>
-          <w:color w:val="5C3114"/>
-          <w:sz w:val="23"/>
-        </w:rPr>
-        <w:t xml:space="preserve">Zadavatel: </w:t>
-      </w:r>
-      <w:r>
-        <w:rPr>
-          <w:rFonts w:ascii="Garamond" w:hAnsi="Garamond"/>
-          <w:b w:val="0"/>
-          <w:i w:val="0"/>
+          <w:rFonts w:ascii="Georgia" w:hAnsi="Georgia"/>
           <w:color w:val="2D1F15"/>
           <w:sz w:val="23"/>
         </w:rPr>
-        <w:t>Kontakt zam?stnavatele, tentokr?t gnom.</w:t>
+        <w:t>(mini BOSS Fight - Velký chumel myšších lidí který ze sebe postaví nějakou postavu)</w:t>
       </w:r>
     </w:p>
     <w:p>
       <w:pPr>
-        <w:spacing w:after="40"/>
+        <w:spacing w:after="60" w:before="160"/>
       </w:pPr>
       <w:r>
         <w:rPr>
-          <w:rFonts w:ascii="Garamond" w:hAnsi="Garamond"/>
-          <w:b/>
-          <w:i w:val="0"/>
-          <w:color w:val="5C3114"/>
-          <w:sz w:val="23"/>
-        </w:rPr>
-        <w:t xml:space="preserve">?kol: </w:t>
-      </w:r>
-      <w:r>
-        <w:rPr>
-          <w:rFonts w:ascii="Garamond" w:hAnsi="Garamond"/>
-          <w:b w:val="0"/>
-          <w:i w:val="0"/>
+          <w:rFonts w:ascii="Georgia" w:hAnsi="Georgia"/>
           <w:color w:val="2D1F15"/>
           <w:sz w:val="23"/>
         </w:rPr>
-        <w:t>Z?skat artefakt, kter? je pro zam?stnavatele mimo??dn? d?le?it?.</w:t>
+        <w:t>Při procházení dungeonem narazí na nějaké nástrahy, pasti a puzzly.</w:t>
       </w:r>
     </w:p>
     <w:p>
       <w:pPr>
-        <w:spacing w:before="260" w:after="80"/>
-        <w:pBdr>
-          <w:bottom w:val="single" w:sz="8" w:space="6" w:color="7A4A22"/>
-        </w:pBdr>
+        <w:spacing w:after="60" w:before="160"/>
+        <w:ind w:left="259"/>
       </w:pPr>
       <w:r>
         <w:rPr>
-          <w:rFonts w:ascii="Garamond" w:hAnsi="Garamond"/>
-          <w:b/>
-          <w:i w:val="0"/>
-          <w:color w:val="5C3114"/>
-          <w:sz w:val="32"/>
+          <w:rFonts w:ascii="Georgia" w:hAnsi="Georgia"/>
+          <w:color w:val="2D1F15"/>
+          <w:sz w:val="23"/>
         </w:rPr>
-        <w:t>Kr?ma ?olas</w:t>
+        <w:t>Dorazí ke dveřím kde by měl být ukrytý artefakt, ten však nedělá úplně to oč je zaměstnavatel prosil.</w:t>
       </w:r>
     </w:p>
     <w:p>
       <w:pPr>
-        <w:spacing w:after="100"/>
+        <w:spacing w:after="60"/>
+        <w:ind w:left="518"/>
       </w:pPr>
       <w:r>
         <w:rPr>
-          <w:rFonts w:ascii="Garamond" w:hAnsi="Garamond"/>
-          <w:b w:val="0"/>
-          <w:i w:val="0"/>
+          <w:rFonts w:ascii="Georgia" w:hAnsi="Georgia"/>
           <w:color w:val="2D1F15"/>
           <w:sz w:val="23"/>
         </w:rPr>
-        <w:t>V kr?m? se dru?ina setk? s gnomem, kter? jim p?ed? z?kladn? informace o hledan?m artefaktu. Pop??e jej jako p?edm?t vyroben? za v?lky, kter? v sob? nese zna?n? mno?stv? magick?ho v?d?n?.</w:t>
+        <w:t>Uvnitř narazí na orka, starého, nemrtvého Azandoga. Myšší lid se tomuto místu vyhýbal jelikož vnímali Azandoga jako nějakého jejich boha.</w:t>
       </w:r>
     </w:p>
     <w:p>
       <w:pPr>
-        <w:pStyle w:val="ListBullet"/>
-        <w:spacing w:after="40"/>
-        <w:ind w:left="360"/>
+        <w:spacing w:after="60"/>
+        <w:ind w:left="778"/>
       </w:pPr>
       <w:r>
         <w:rPr>
-          <w:rFonts w:ascii="Garamond" w:hAnsi="Garamond"/>
-          <w:b w:val="0"/>
-          <w:i w:val="0"/>
+          <w:rFonts w:ascii="Georgia" w:hAnsi="Georgia"/>
           <w:color w:val="2D1F15"/>
           <w:sz w:val="23"/>
         </w:rPr>
-        <w:t>Gnom by m?l p?sobit informovan?, ale nemus? ??kat ?pln? v?echno.</w:t>
+        <w:t>Po jeho poražení se z něj nakonec jeden z Bohů také stane, Bůh zášti a vzteku. Azandog bude mít takový jako zvláštní dvojzubec, se kterým bude bojovat (prokletý).</w:t>
       </w:r>
     </w:p>
     <w:p>
       <w:pPr>
-        <w:pStyle w:val="ListBullet"/>
-        <w:spacing w:after="40"/>
-        <w:ind w:left="360"/>
+        <w:spacing w:after="60"/>
+        <w:ind w:left="778"/>
       </w:pPr>
       <w:r>
         <w:rPr>
-          <w:rFonts w:ascii="Garamond" w:hAnsi="Garamond"/>
-          <w:b w:val="0"/>
-          <w:i w:val="0"/>
+          <w:rFonts w:ascii="Georgia" w:hAnsi="Georgia"/>
           <w:color w:val="2D1F15"/>
           <w:sz w:val="23"/>
         </w:rPr>
-        <w:t>Artefakt m? b?t cenn? nejen finan?n?, ale hlavn? znalostmi, kter? obsahuje.</w:t>
+        <w:t>Jakmile se jim podaří Azandoga zabít mohou z něj artefakt odebrat a bude hotovo.</w:t>
       </w:r>
     </w:p>
     <w:p>
       <w:pPr>
-        <w:pStyle w:val="ListBullet"/>
-        <w:spacing w:after="40"/>
-        <w:ind w:left="360"/>
+        <w:spacing w:after="60" w:before="160"/>
+        <w:ind w:left="259"/>
       </w:pPr>
       <w:r>
         <w:rPr>
-          <w:rFonts w:ascii="Garamond" w:hAnsi="Garamond"/>
-          <w:b w:val="0"/>
-          <w:i w:val="0"/>
+          <w:rFonts w:ascii="Georgia" w:hAnsi="Georgia"/>
           <w:color w:val="2D1F15"/>
           <w:sz w:val="23"/>
         </w:rPr>
-        <w:t>Zad?n? m? hr??e nasm?rovat ke star? propadl? pevnosti.</w:t>
+        <w:t>Zbytek podle toho jaké budou postavy</w:t>
       </w:r>
     </w:p>
     <w:p>
       <w:pPr>
-        <w:spacing w:before="260" w:after="80"/>
-        <w:pBdr>
-          <w:bottom w:val="single" w:sz="8" w:space="6" w:color="7A4A22"/>
-        </w:pBdr>
+        <w:spacing w:after="60" w:before="160"/>
       </w:pPr>
       <w:r>
         <w:rPr>
-          <w:rFonts w:ascii="Garamond" w:hAnsi="Garamond"/>
-          <w:b/>
-          <w:i w:val="0"/>
-          <w:color w:val="5C3114"/>
-          <w:sz w:val="32"/>
-        </w:rPr>
-        <w:t>Cesta k propadl? pevnosti</w:t>
-      </w:r>
-    </w:p>
-    <w:p>
-      <w:pPr>
-        <w:spacing w:after="100"/>
-      </w:pPr>
-      <w:r>
-        <w:rPr>
-          <w:rFonts w:ascii="Garamond" w:hAnsi="Garamond"/>
-          <w:b w:val="0"/>
-          <w:i w:val="0"/>
+          <w:rFonts w:ascii="Georgia" w:hAnsi="Georgia"/>
           <w:color w:val="2D1F15"/>
           <w:sz w:val="23"/>
         </w:rPr>
-        <w:t>Gnom dru?inu odk??e na starou pevnost, kter? byla za v?lky zavalena. Do pevnosti na?t?st? st?le vede jedna zadn? cesta. Samotn? cestov?n? m??e b?t zkr?cen? nebo odehran? jen jako kr?tk? mont??, aby se hra rychle dostala k hlavn? ??sti dobrodru?stv?.</w:t>
-      </w:r>
-    </w:p>
-    <w:p>
-      <w:pPr>
-        <w:pStyle w:val="ListBullet"/>
-        <w:spacing w:after="40"/>
-        <w:ind w:left="360"/>
-      </w:pPr>
-      <w:r>
-        <w:rPr>
-          <w:rFonts w:ascii="Garamond" w:hAnsi="Garamond"/>
-          <w:b w:val="0"/>
-          <w:i w:val="0"/>
-          <w:color w:val="2D1F15"/>
-          <w:sz w:val="23"/>
-        </w:rPr>
-        <w:t>Cesta m??e nazna?it starou v?lku, opu?t?n? ?zem? nebo naru?enou krajinu.</w:t>
-      </w:r>
-    </w:p>
-    <w:p>
-      <w:pPr>
-        <w:pStyle w:val="ListBullet"/>
-        <w:spacing w:after="40"/>
-        <w:ind w:left="360"/>
-      </w:pPr>
-      <w:r>
-        <w:rPr>
-          <w:rFonts w:ascii="Garamond" w:hAnsi="Garamond"/>
-          <w:b w:val="0"/>
-          <w:i w:val="0"/>
-          <w:color w:val="2D1F15"/>
-          <w:sz w:val="23"/>
-        </w:rPr>
-        <w:t>Nen? pot?eba dlouh? cestovn? dobrodru?stv?, pokud nebude pot?eba vyplnit ?as.</w:t>
-      </w:r>
-    </w:p>
-    <w:p>
-      <w:pPr>
-        <w:spacing w:before="260" w:after="80"/>
-        <w:pBdr>
-          <w:bottom w:val="single" w:sz="8" w:space="6" w:color="7A4A22"/>
-        </w:pBdr>
-      </w:pPr>
-      <w:r>
-        <w:rPr>
-          <w:rFonts w:ascii="Garamond" w:hAnsi="Garamond"/>
-          <w:b/>
-          <w:i w:val="0"/>
-          <w:color w:val="5C3114"/>
-          <w:sz w:val="32"/>
-        </w:rPr>
-        <w:t>Propadl? pevnost my??ho lidu</w:t>
-      </w:r>
-    </w:p>
-    <w:p>
-      <w:pPr>
-        <w:spacing w:after="100"/>
-      </w:pPr>
-      <w:r>
-        <w:rPr>
-          <w:rFonts w:ascii="Garamond" w:hAnsi="Garamond"/>
-          <w:b w:val="0"/>
-          <w:i w:val="0"/>
-          <w:color w:val="2D1F15"/>
-          <w:sz w:val="23"/>
-        </w:rPr>
-        <w:t>Uvnit? pevnosti dru?ina najde star? zapadl? s?dlo my??ch lid?. Pevnost ale nen? pr?zdn?. My?? lid? zde po zavalen? ?ili dlouhou dobu v izolaci, a proto budou v??i cizinc?m podez??vav?, rozh?dan? a nejist?, co s dru?inou ud?lat.</w:t>
-      </w:r>
-    </w:p>
-    <w:p>
-      <w:pPr>
-        <w:pStyle w:val="ListBullet"/>
-        <w:spacing w:after="40"/>
-        <w:ind w:left="360"/>
-      </w:pPr>
-      <w:r>
-        <w:rPr>
-          <w:rFonts w:ascii="Garamond" w:hAnsi="Garamond"/>
-          <w:b w:val="0"/>
-          <w:i w:val="0"/>
-          <w:color w:val="2D1F15"/>
-          <w:sz w:val="23"/>
-        </w:rPr>
-        <w:t>My?? lid? se mezi sebou h?daj?, jestli dru?inu zab?t, zajmout, vyhnat, nebo vyu??t.</w:t>
-      </w:r>
-    </w:p>
-    <w:p>
-      <w:pPr>
-        <w:pStyle w:val="ListBullet"/>
-        <w:spacing w:after="40"/>
-        <w:ind w:left="360"/>
-      </w:pPr>
-      <w:r>
-        <w:rPr>
-          <w:rFonts w:ascii="Garamond" w:hAnsi="Garamond"/>
-          <w:b w:val="0"/>
-          <w:i w:val="0"/>
-          <w:color w:val="2D1F15"/>
-          <w:sz w:val="23"/>
-        </w:rPr>
-        <w:t>Je mo?n? z toho ud?lat soci?ln? sc?nu, chaos, nebo kr?tkou poty?ku.</w:t>
-      </w:r>
-    </w:p>
-    <w:p>
-      <w:pPr>
-        <w:pStyle w:val="ListBullet"/>
-        <w:spacing w:after="40"/>
-        <w:ind w:left="360"/>
-      </w:pPr>
-      <w:r>
-        <w:rPr>
-          <w:rFonts w:ascii="Garamond" w:hAnsi="Garamond"/>
-          <w:b w:val="0"/>
-          <w:i w:val="0"/>
-          <w:color w:val="2D1F15"/>
-          <w:sz w:val="23"/>
-        </w:rPr>
-        <w:t>Mini bossfight: velk? chumel my??ch lid?, kte?? se seskl?daj? do jedn? bojov? postavy.</w:t>
-      </w:r>
-    </w:p>
-    <w:p>
-      <w:pPr>
-        <w:spacing w:before="260" w:after="80"/>
-        <w:pBdr>
-          <w:bottom w:val="single" w:sz="8" w:space="6" w:color="7A4A22"/>
-        </w:pBdr>
-      </w:pPr>
-      <w:r>
-        <w:rPr>
-          <w:rFonts w:ascii="Garamond" w:hAnsi="Garamond"/>
-          <w:b/>
-          <w:i w:val="0"/>
-          <w:color w:val="5C3114"/>
-          <w:sz w:val="32"/>
-        </w:rPr>
-        <w:t>Dungeon</w:t>
-      </w:r>
-    </w:p>
-    <w:p>
-      <w:pPr>
-        <w:spacing w:after="100"/>
-      </w:pPr>
-      <w:r>
-        <w:rPr>
-          <w:rFonts w:ascii="Garamond" w:hAnsi="Garamond"/>
-          <w:b w:val="0"/>
-          <w:i w:val="0"/>
-          <w:color w:val="2D1F15"/>
-          <w:sz w:val="23"/>
-        </w:rPr>
-        <w:t>P?i pr?chodu pevnost? by dru?ina m?la narazit na star? n?strahy, pasti a puzzly. Pevnost m? p?sobit jako m?sto, kter? bylo kdysi funk?n?, ale dlouh? izolace, rozpad a my?? obyvatel? jej zm?nili v nebezpe?n? bludi?t?.</w:t>
-      </w:r>
-    </w:p>
-    <w:p>
-      <w:pPr>
-        <w:pStyle w:val="ListBullet"/>
-        <w:spacing w:after="40"/>
-        <w:ind w:left="360"/>
-      </w:pPr>
-      <w:r>
-        <w:rPr>
-          <w:rFonts w:ascii="Garamond" w:hAnsi="Garamond"/>
-          <w:b w:val="0"/>
-          <w:i w:val="0"/>
-          <w:color w:val="2D1F15"/>
-          <w:sz w:val="23"/>
-        </w:rPr>
-        <w:t>Star? v?le?n? mechanismy.</w:t>
-      </w:r>
-    </w:p>
-    <w:p>
-      <w:pPr>
-        <w:pStyle w:val="ListBullet"/>
-        <w:spacing w:after="40"/>
-        <w:ind w:left="360"/>
-      </w:pPr>
-      <w:r>
-        <w:rPr>
-          <w:rFonts w:ascii="Garamond" w:hAnsi="Garamond"/>
-          <w:b w:val="0"/>
-          <w:i w:val="0"/>
-          <w:color w:val="2D1F15"/>
-          <w:sz w:val="23"/>
-        </w:rPr>
-        <w:t>Provizorn? pasti my??ch lid?.</w:t>
-      </w:r>
-    </w:p>
-    <w:p>
-      <w:pPr>
-        <w:pStyle w:val="ListBullet"/>
-        <w:spacing w:after="40"/>
-        <w:ind w:left="360"/>
-      </w:pPr>
-      <w:r>
-        <w:rPr>
-          <w:rFonts w:ascii="Garamond" w:hAnsi="Garamond"/>
-          <w:b w:val="0"/>
-          <w:i w:val="0"/>
-          <w:color w:val="2D1F15"/>
-          <w:sz w:val="23"/>
-        </w:rPr>
-        <w:t>Z??cen? chodby a ?zk? pr?lezy.</w:t>
-      </w:r>
-    </w:p>
-    <w:p>
-      <w:pPr>
-        <w:pStyle w:val="ListBullet"/>
-        <w:spacing w:after="40"/>
-        <w:ind w:left="360"/>
-      </w:pPr>
-      <w:r>
-        <w:rPr>
-          <w:rFonts w:ascii="Garamond" w:hAnsi="Garamond"/>
-          <w:b w:val="0"/>
-          <w:i w:val="0"/>
-          <w:color w:val="2D1F15"/>
-          <w:sz w:val="23"/>
-        </w:rPr>
-        <w:t>Puzzle chr?n?c? p??stup k m?stnosti s artefaktem.</w:t>
-      </w:r>
-    </w:p>
-    <w:p>
-      <w:pPr>
-        <w:spacing w:before="260" w:after="80"/>
-        <w:pBdr>
-          <w:bottom w:val="single" w:sz="8" w:space="6" w:color="7A4A22"/>
-        </w:pBdr>
-      </w:pPr>
-      <w:r>
-        <w:rPr>
-          <w:rFonts w:ascii="Garamond" w:hAnsi="Garamond"/>
-          <w:b/>
-          <w:i w:val="0"/>
-          <w:color w:val="5C3114"/>
-          <w:sz w:val="32"/>
-        </w:rPr>
-        <w:t>Dve?e k artefaktu</w:t>
-      </w:r>
-    </w:p>
-    <w:p>
-      <w:pPr>
-        <w:spacing w:after="100"/>
-      </w:pPr>
-      <w:r>
-        <w:rPr>
-          <w:rFonts w:ascii="Garamond" w:hAnsi="Garamond"/>
-          <w:b w:val="0"/>
-          <w:i w:val="0"/>
-          <w:color w:val="2D1F15"/>
-          <w:sz w:val="23"/>
-        </w:rPr>
-        <w:t>Dru?ina nakonec doraz? ke dve??m, za kter?mi by m?l b?t ukryt? artefakt. Jen?e artefakt ned?l? p?esn? to, o co zam?stnavatel ??dal, nebo je s n?m spojen? n?co mnohem hor??ho, ne? gnom nazna?il.</w:t>
-      </w:r>
-    </w:p>
-    <w:p>
-      <w:pPr>
-        <w:spacing w:after="100"/>
-      </w:pPr>
-      <w:r>
-        <w:rPr>
-          <w:rFonts w:ascii="Garamond" w:hAnsi="Garamond"/>
-          <w:b w:val="0"/>
-          <w:i w:val="0"/>
-          <w:color w:val="2D1F15"/>
-          <w:sz w:val="23"/>
-        </w:rPr>
-        <w:t>Za dve?mi se nach?z? star? nemrtv? ork Azandog. My?? lid? se tomuto m?stu vyh?bali, proto?e Azandoga vn?mali jako bytost na hranici bo?stv? nebo jako temn?ho ochr?nce zak?zan? ??sti pevnosti.</w:t>
-      </w:r>
-    </w:p>
-    <w:p>
-      <w:pPr>
-        <w:spacing w:before="260" w:after="80"/>
-        <w:pBdr>
-          <w:bottom w:val="single" w:sz="8" w:space="6" w:color="7A4A22"/>
-        </w:pBdr>
-      </w:pPr>
-      <w:r>
-        <w:rPr>
-          <w:rFonts w:ascii="Garamond" w:hAnsi="Garamond"/>
-          <w:b/>
-          <w:i w:val="0"/>
-          <w:color w:val="5C3114"/>
-          <w:sz w:val="32"/>
-        </w:rPr>
-        <w:t>Azandog</w:t>
-      </w:r>
-    </w:p>
-    <w:p>
-      <w:pPr>
-        <w:spacing w:after="100"/>
-      </w:pPr>
-      <w:r>
-        <w:rPr>
-          <w:rFonts w:ascii="Garamond" w:hAnsi="Garamond"/>
-          <w:b w:val="0"/>
-          <w:i w:val="0"/>
-          <w:color w:val="2D1F15"/>
-          <w:sz w:val="23"/>
-        </w:rPr>
-        <w:t>Azandog je star? nemrtv? ork, kter? bojuje zvl??tn?m proklet?m dvojzubcem. Po pora?en? se z n?j nakonec stane jeden z boh?: B?h z??ti a vzteku. Bossfight by m?l m?t dv? f?ze a p?sobit jako moment, kdy hr??i zjist?, ?e skute?n?m probl?mem nen? jen str??ce artefaktu, ale samotn? nen?vist, kter? ho dr?? p?i existenci.</w:t>
-      </w:r>
-    </w:p>
-    <w:p>
-      <w:pPr>
-        <w:pStyle w:val="ListBullet"/>
-        <w:spacing w:after="40"/>
-        <w:ind w:left="360"/>
-      </w:pPr>
-      <w:r>
-        <w:rPr>
-          <w:rFonts w:ascii="Garamond" w:hAnsi="Garamond"/>
-          <w:b w:val="0"/>
-          <w:i w:val="0"/>
-          <w:color w:val="2D1F15"/>
-          <w:sz w:val="23"/>
-        </w:rPr>
-        <w:t>F?ze 1: star? nemrtv? or?? vl?dce.</w:t>
-      </w:r>
-    </w:p>
-    <w:p>
-      <w:pPr>
-        <w:pStyle w:val="ListBullet"/>
-        <w:spacing w:after="40"/>
-        <w:ind w:left="360"/>
-      </w:pPr>
-      <w:r>
-        <w:rPr>
-          <w:rFonts w:ascii="Garamond" w:hAnsi="Garamond"/>
-          <w:b w:val="0"/>
-          <w:i w:val="0"/>
-          <w:color w:val="2D1F15"/>
-          <w:sz w:val="23"/>
-        </w:rPr>
-        <w:t>P?echod: smrt v prvn? f?zi aktivuje artefakt nebo kl??.</w:t>
-      </w:r>
-    </w:p>
-    <w:p>
-      <w:pPr>
-        <w:pStyle w:val="ListBullet"/>
-        <w:spacing w:after="40"/>
-        <w:ind w:left="360"/>
-      </w:pPr>
-      <w:r>
-        <w:rPr>
-          <w:rFonts w:ascii="Garamond" w:hAnsi="Garamond"/>
-          <w:b w:val="0"/>
-          <w:i w:val="0"/>
-          <w:color w:val="2D1F15"/>
-          <w:sz w:val="23"/>
-        </w:rPr>
-        <w:t>F?ze 2: Azandog jako ni??? b?h hn?vu a z??t?.</w:t>
-      </w:r>
-    </w:p>
-    <w:p>
-      <w:pPr>
-        <w:pStyle w:val="ListBullet"/>
-        <w:spacing w:after="40"/>
-        <w:ind w:left="360"/>
-      </w:pPr>
-      <w:r>
-        <w:rPr>
-          <w:rFonts w:ascii="Garamond" w:hAnsi="Garamond"/>
-          <w:b w:val="0"/>
-          <w:i w:val="0"/>
-          <w:color w:val="2D1F15"/>
-          <w:sz w:val="23"/>
-        </w:rPr>
-        <w:t>Po jeho pora?en? mohou hr??i artefakt odebrat.</w:t>
-      </w:r>
-    </w:p>
-    <w:p>
-      <w:pPr>
-        <w:spacing w:before="260" w:after="80"/>
-        <w:pBdr>
-          <w:bottom w:val="single" w:sz="8" w:space="6" w:color="7A4A22"/>
-        </w:pBdr>
-      </w:pPr>
-      <w:r>
-        <w:rPr>
-          <w:rFonts w:ascii="Garamond" w:hAnsi="Garamond"/>
-          <w:b/>
-          <w:i w:val="0"/>
-          <w:color w:val="5C3114"/>
-          <w:sz w:val="32"/>
-        </w:rPr>
-        <w:t>Artefakt</w:t>
-      </w:r>
-    </w:p>
-    <w:p>
-      <w:pPr>
-        <w:spacing w:after="100"/>
-      </w:pPr>
-      <w:r>
-        <w:rPr>
-          <w:rFonts w:ascii="Garamond" w:hAnsi="Garamond"/>
-          <w:b w:val="0"/>
-          <w:i w:val="0"/>
-          <w:color w:val="2D1F15"/>
-          <w:sz w:val="23"/>
-        </w:rPr>
-        <w:t>Artefakt m? b?t v?le?n? p?edm?t pln? magick?ho v?d?n?. Z pohledu zad?n? je hlavn?m c?lem v?pravy, ale ve skute?nosti m??e b?t tak? d?vodem, pro? Azandog st?le existuje nebo pro? se po por??ce prom?n?.</w:t>
-      </w:r>
-    </w:p>
-    <w:p>
-      <w:pPr>
-        <w:pStyle w:val="ListBullet"/>
-        <w:spacing w:after="40"/>
-        <w:ind w:left="360"/>
-      </w:pPr>
-      <w:r>
-        <w:rPr>
-          <w:rFonts w:ascii="Garamond" w:hAnsi="Garamond"/>
-          <w:b w:val="0"/>
-          <w:i w:val="0"/>
-          <w:color w:val="2D1F15"/>
-          <w:sz w:val="23"/>
-        </w:rPr>
-        <w:t>M??e fungovat jako kl??, schr?nka, relikvie nebo zdroj zak?zan?ho v?d?n?.</w:t>
-      </w:r>
-    </w:p>
-    <w:p>
-      <w:pPr>
-        <w:pStyle w:val="ListBullet"/>
-        <w:spacing w:after="40"/>
-        <w:ind w:left="360"/>
-      </w:pPr>
-      <w:r>
-        <w:rPr>
-          <w:rFonts w:ascii="Garamond" w:hAnsi="Garamond"/>
-          <w:b w:val="0"/>
-          <w:i w:val="0"/>
-          <w:color w:val="2D1F15"/>
-          <w:sz w:val="23"/>
-        </w:rPr>
-        <w:t>Zam?stnavatel chce artefakt z?skat, ale nemus? dru?in? ??ct celou pravdu.</w:t>
-      </w:r>
-    </w:p>
-    <w:p>
-      <w:pPr>
-        <w:pStyle w:val="ListBullet"/>
-        <w:spacing w:after="40"/>
-        <w:ind w:left="360"/>
-      </w:pPr>
-      <w:r>
-        <w:rPr>
-          <w:rFonts w:ascii="Garamond" w:hAnsi="Garamond"/>
-          <w:b w:val="0"/>
-          <w:i w:val="0"/>
-          <w:color w:val="2D1F15"/>
-          <w:sz w:val="23"/>
-        </w:rPr>
-        <w:t>Po Azandogov? por??ce je mo?n? artefakt bezpe?n? odebrat, nebo alespo? z?skat za cenu n?sledk?.</w:t>
-      </w:r>
-    </w:p>
-    <w:p>
-      <w:pPr>
-        <w:spacing w:before="260" w:after="80"/>
-        <w:pBdr>
-          <w:bottom w:val="single" w:sz="8" w:space="6" w:color="7A4A22"/>
-        </w:pBdr>
-      </w:pPr>
-      <w:r>
-        <w:rPr>
-          <w:rFonts w:ascii="Garamond" w:hAnsi="Garamond"/>
-          <w:b/>
-          <w:i w:val="0"/>
-          <w:color w:val="5C3114"/>
-          <w:sz w:val="32"/>
-        </w:rPr>
-        <w:t>Otev?en? body</w:t>
-      </w:r>
-    </w:p>
-    <w:p>
-      <w:pPr>
-        <w:pStyle w:val="ListBullet"/>
-        <w:spacing w:after="40"/>
-        <w:ind w:left="360"/>
-      </w:pPr>
-      <w:r>
-        <w:rPr>
-          <w:rFonts w:ascii="Garamond" w:hAnsi="Garamond"/>
-          <w:b w:val="0"/>
-          <w:i w:val="0"/>
-          <w:color w:val="2D1F15"/>
-          <w:sz w:val="23"/>
-        </w:rPr>
-        <w:t>Detaily ?vodn? loupe?e upravit podle hotov?ch postav.</w:t>
-      </w:r>
-    </w:p>
-    <w:p>
-      <w:pPr>
-        <w:pStyle w:val="ListBullet"/>
-        <w:spacing w:after="40"/>
-        <w:ind w:left="360"/>
-      </w:pPr>
-      <w:r>
-        <w:rPr>
-          <w:rFonts w:ascii="Garamond" w:hAnsi="Garamond"/>
-          <w:b w:val="0"/>
-          <w:i w:val="0"/>
-          <w:color w:val="2D1F15"/>
-          <w:sz w:val="23"/>
-        </w:rPr>
-        <w:t>Rozhodnout, co p?esn? artefakt um? a pro? ho zam?stnavatel chce.</w:t>
-      </w:r>
-    </w:p>
-    <w:p>
-      <w:pPr>
-        <w:pStyle w:val="ListBullet"/>
-        <w:spacing w:after="40"/>
-        <w:ind w:left="360"/>
-      </w:pPr>
-      <w:r>
-        <w:rPr>
-          <w:rFonts w:ascii="Garamond" w:hAnsi="Garamond"/>
-          <w:b w:val="0"/>
-          <w:i w:val="0"/>
-          <w:color w:val="2D1F15"/>
-          <w:sz w:val="23"/>
-        </w:rPr>
-        <w:t>Doplnit konkr?tn? pasti, puzzly a mapu propadl? pevnosti.</w:t>
-      </w:r>
-    </w:p>
-    <w:p>
-      <w:pPr>
-        <w:pStyle w:val="ListBullet"/>
-        <w:spacing w:after="40"/>
-        <w:ind w:left="360"/>
-      </w:pPr>
-      <w:r>
-        <w:rPr>
-          <w:rFonts w:ascii="Garamond" w:hAnsi="Garamond"/>
-          <w:b w:val="0"/>
-          <w:i w:val="0"/>
-          <w:color w:val="2D1F15"/>
-          <w:sz w:val="23"/>
-        </w:rPr>
-        <w:t>Rozpracovat my?? lid a jejich vztah k Azandogovi.</w:t>
-      </w:r>
-    </w:p>
-    <w:p>
-      <w:pPr>
-        <w:pStyle w:val="ListBullet"/>
-        <w:spacing w:after="40"/>
-        <w:ind w:left="360"/>
-      </w:pPr>
-      <w:r>
-        <w:rPr>
-          <w:rFonts w:ascii="Garamond" w:hAnsi="Garamond"/>
-          <w:b w:val="0"/>
-          <w:i w:val="0"/>
-          <w:color w:val="2D1F15"/>
-          <w:sz w:val="23"/>
-        </w:rPr>
-        <w:t>Zbytek dobrodru?stv? p?izp?sobit podle slo?en? dru?iny.</w:t>
+        <w:t>Artefakt pro který je kněz Mondylův pošle je Jeden z klíčů k Trisiaskému Trezoru. Mondylův kněží ho po získání předá do krabice.</w:t>
       </w:r>
     </w:p>
     <w:sectPr>
@@ -1308,8 +649,11 @@
     <w:name w:val="Normal"/>
     <w:qFormat/>
     <w:rsid w:val="00FC693F"/>
+    <w:pPr>
+      <w:spacing w:after="60" w:line="259" w:lineRule="auto"/>
+    </w:pPr>
     <w:rPr>
-      <w:rFonts w:ascii="Garamond" w:hAnsi="Garamond"/>
+      <w:rFonts w:ascii="Georgia" w:hAnsi="Georgia"/>
       <w:color w:val="2D1F15"/>
       <w:sz w:val="23"/>
     </w:rPr>

</xml_diff>